<commit_message>
Point the capstone deck at the published StudyCite app.
The first app's live demo is the Amplify host, with screenshots of that build, and App Runner stays a config file rather than the address that answers.

Co-authored-by: zengpu29 <zengpu29@gmail.com>
</commit_message>
<xml_diff>
--- a/CAPSTONE_REFLECTION.docx
+++ b/CAPSTONE_REFLECTION.docx
@@ -79,7 +79,7 @@
           <w:color w:val="000000"/>
           <w:sz w:val="24"/>
         </w:rPr>
-        <w:t>October 18, 2026</w:t>
+        <w:t>October 19, 2026</w:t>
       </w:r>
     </w:p>
     <w:p>
@@ -95,7 +95,7 @@
           <w:color w:val="000000"/>
           <w:sz w:val="24"/>
         </w:rPr>
-        <w:t>Workshops 1 through 6 moved me from a single-file clinical prototype to a second application whose limits are enforced in code. StudyCite began as TrialLens AI, a browser assistant for clinical-trial documents. That prototype is still reachable at triallens-ai.ai.studio. BiteWise, the meal assistant, is public at bitewise-ai.ai.studio. The useful change was not a longer prompt. It was deciding, before the model runs, which records it is allowed to see.</w:t>
+        <w:t>Workshops 1 through 6 moved me from a single-file clinical prototype to a second application whose limits are enforced in code. StudyCite, the clinical-trial assistant, is published at main.d18cernwuahm9n.amplifyapp.com. It began as TrialLens AI. BiteWise, the meal assistant, is public at bitewise-ai.ai.studio. The useful change was not a longer prompt. It was deciding, before the model runs, which records it is allowed to see.</w:t>
       </w:r>
     </w:p>
     <w:p>
@@ -143,7 +143,7 @@
           <w:color w:val="000000"/>
           <w:sz w:val="24"/>
         </w:rPr>
-        <w:t>Workshop 3 taught me to separate a deployment file from a deployment. I verified AWS command-line access in us-west-2 and added an App Runner configuration that installs dependencies, builds the client, and serves the Vite preview on port 8080. The StudyCite README still records no public App Runner address. The URL that answers is the earlier prototype. I will not present a console I cannot open.</w:t>
+        <w:t>Workshop 3 taught me to separate a deployment file from a deployment. I verified AWS command-line access in us-west-2 and checked in an App Runner file that builds the client and serves a Vite preview. That file is not the address that answers. StudyCite is on AWS Amplify, with CloudFront in front of the built site, last modified September 24, 2026. I opened it again on October 19, 2026. Retrieval still runs in the browser.</w:t>
       </w:r>
     </w:p>
     <w:p>

</xml_diff>